<commit_message>
docs: add lab report, step log and screenshots
</commit_message>
<xml_diff>
--- a/Experiment8_Step_Log.docx
+++ b/Experiment8_Step_Log.docx
@@ -532,6 +532,310 @@
         </w:drawing>
       </w:r>
     </w:p>
+    <w:p>
+      <w:r>
+        <w:rPr>
+          <w:b/>
+        </w:rPr>
+        <w:t xml:space="preserve">Step 12: </w:t>
+      </w:r>
+      <w:r>
+        <w:t>Task 2.1 (done by student): created the Docker Hub access token and added the DOCKERHUB_USERNAME and DOCKERHUB_TOKEN repository secrets in GitHub (Settings &gt; Secrets and variables &gt; Actions).</w:t>
+      </w:r>
+    </w:p>
+    <w:p>
+      <w:r>
+        <w:rPr>
+          <w:b/>
+        </w:rPr>
+        <w:t xml:space="preserve">Step 13: </w:t>
+      </w:r>
+      <w:r>
+        <w:t>Task 2.3: added the GitHub remote, committed with 'feat: configure GitHub Actions CI/CD pipeline' and ran 'git push origin main'.</w:t>
+      </w:r>
+    </w:p>
+    <w:p>
+      <w:r>
+        <w:drawing>
+          <wp:inline xmlns:a="http://schemas.openxmlformats.org/drawingml/2006/main" xmlns:pic="http://schemas.openxmlformats.org/drawingml/2006/picture">
+            <wp:extent cx="5943600" cy="3171721"/>
+            <wp:docPr id="12" name="Picture 12"/>
+            <wp:cNvGraphicFramePr>
+              <a:graphicFrameLocks noChangeAspect="1"/>
+            </wp:cNvGraphicFramePr>
+            <a:graphic>
+              <a:graphicData uri="http://schemas.openxmlformats.org/drawingml/2006/picture">
+                <pic:pic>
+                  <pic:nvPicPr>
+                    <pic:cNvPr id="0" name="12_git_push.png"/>
+                    <pic:cNvPicPr/>
+                  </pic:nvPicPr>
+                  <pic:blipFill>
+                    <a:blip r:embed="rId20"/>
+                    <a:stretch>
+                      <a:fillRect/>
+                    </a:stretch>
+                  </pic:blipFill>
+                  <pic:spPr>
+                    <a:xfrm>
+                      <a:off x="0" y="0"/>
+                      <a:ext cx="5943600" cy="3171721"/>
+                    </a:xfrm>
+                    <a:prstGeom prst="rect"/>
+                  </pic:spPr>
+                </pic:pic>
+              </a:graphicData>
+            </a:graphic>
+          </wp:inline>
+        </w:drawing>
+      </w:r>
+    </w:p>
+    <w:p>
+      <w:r>
+        <w:rPr>
+          <w:b/>
+        </w:rPr>
+        <w:t xml:space="preserve">Step 14: </w:t>
+      </w:r>
+      <w:r>
+        <w:t>Task 2.3: the code is now on GitHub at github.com/manishraje28/exp8-k8s-cicd, with deployment.yaml and .github/workflows/ci-cd.yml.</w:t>
+      </w:r>
+    </w:p>
+    <w:p>
+      <w:r>
+        <w:drawing>
+          <wp:inline xmlns:a="http://schemas.openxmlformats.org/drawingml/2006/main" xmlns:pic="http://schemas.openxmlformats.org/drawingml/2006/picture">
+            <wp:extent cx="5943600" cy="3714750"/>
+            <wp:docPr id="13" name="Picture 13"/>
+            <wp:cNvGraphicFramePr>
+              <a:graphicFrameLocks noChangeAspect="1"/>
+            </wp:cNvGraphicFramePr>
+            <a:graphic>
+              <a:graphicData uri="http://schemas.openxmlformats.org/drawingml/2006/picture">
+                <pic:pic>
+                  <pic:nvPicPr>
+                    <pic:cNvPr id="0" name="13_github_repo.png"/>
+                    <pic:cNvPicPr/>
+                  </pic:nvPicPr>
+                  <pic:blipFill>
+                    <a:blip r:embed="rId21"/>
+                    <a:stretch>
+                      <a:fillRect/>
+                    </a:stretch>
+                  </pic:blipFill>
+                  <pic:spPr>
+                    <a:xfrm>
+                      <a:off x="0" y="0"/>
+                      <a:ext cx="5943600" cy="3714750"/>
+                    </a:xfrm>
+                    <a:prstGeom prst="rect"/>
+                  </pic:spPr>
+                </pic:pic>
+              </a:graphicData>
+            </a:graphic>
+          </wp:inline>
+        </w:drawing>
+      </w:r>
+    </w:p>
+    <w:p>
+      <w:r>
+        <w:rPr>
+          <w:b/>
+        </w:rPr>
+        <w:t xml:space="preserve">Step 15: </w:t>
+      </w:r>
+      <w:r>
+        <w:t>Task 2.3: the push triggered the 'CI/CD Pipeline - Build and Push' workflow; run #1 completed green in 26s (Screenshot 2 deliverable).</w:t>
+      </w:r>
+    </w:p>
+    <w:p>
+      <w:r>
+        <w:drawing>
+          <wp:inline xmlns:a="http://schemas.openxmlformats.org/drawingml/2006/main" xmlns:pic="http://schemas.openxmlformats.org/drawingml/2006/picture">
+            <wp:extent cx="5943600" cy="3714750"/>
+            <wp:docPr id="14" name="Picture 14"/>
+            <wp:cNvGraphicFramePr>
+              <a:graphicFrameLocks noChangeAspect="1"/>
+            </wp:cNvGraphicFramePr>
+            <a:graphic>
+              <a:graphicData uri="http://schemas.openxmlformats.org/drawingml/2006/picture">
+                <pic:pic>
+                  <pic:nvPicPr>
+                    <pic:cNvPr id="0" name="14_actions_green_run.png"/>
+                    <pic:cNvPicPr/>
+                  </pic:nvPicPr>
+                  <pic:blipFill>
+                    <a:blip r:embed="rId22"/>
+                    <a:stretch>
+                      <a:fillRect/>
+                    </a:stretch>
+                  </pic:blipFill>
+                  <pic:spPr>
+                    <a:xfrm>
+                      <a:off x="0" y="0"/>
+                      <a:ext cx="5943600" cy="3714750"/>
+                    </a:xfrm>
+                    <a:prstGeom prst="rect"/>
+                  </pic:spPr>
+                </pic:pic>
+              </a:graphicData>
+            </a:graphic>
+          </wp:inline>
+        </w:drawing>
+      </w:r>
+    </w:p>
+    <w:p>
+      <w:r>
+        <w:rPr>
+          <w:b/>
+        </w:rPr>
+        <w:t xml:space="preserve">Step 16: </w:t>
+      </w:r>
+      <w:r>
+        <w:t>Task 2.3: pipeline log - every step of the build-and-push job passed (Checkout, Docker Hub login, Buildx setup, Build and Push).</w:t>
+      </w:r>
+    </w:p>
+    <w:p>
+      <w:r>
+        <w:drawing>
+          <wp:inline xmlns:a="http://schemas.openxmlformats.org/drawingml/2006/main" xmlns:pic="http://schemas.openxmlformats.org/drawingml/2006/picture">
+            <wp:extent cx="5943600" cy="3714750"/>
+            <wp:docPr id="15" name="Picture 15"/>
+            <wp:cNvGraphicFramePr>
+              <a:graphicFrameLocks noChangeAspect="1"/>
+            </wp:cNvGraphicFramePr>
+            <a:graphic>
+              <a:graphicData uri="http://schemas.openxmlformats.org/drawingml/2006/picture">
+                <pic:pic>
+                  <pic:nvPicPr>
+                    <pic:cNvPr id="0" name="16_actions_job_steps.png"/>
+                    <pic:cNvPicPr/>
+                  </pic:nvPicPr>
+                  <pic:blipFill>
+                    <a:blip r:embed="rId23"/>
+                    <a:stretch>
+                      <a:fillRect/>
+                    </a:stretch>
+                  </pic:blipFill>
+                  <pic:spPr>
+                    <a:xfrm>
+                      <a:off x="0" y="0"/>
+                      <a:ext cx="5943600" cy="3714750"/>
+                    </a:xfrm>
+                    <a:prstGeom prst="rect"/>
+                  </pic:spPr>
+                </pic:pic>
+              </a:graphicData>
+            </a:graphic>
+          </wp:inline>
+        </w:drawing>
+      </w:r>
+    </w:p>
+    <w:p>
+      <w:r>
+        <w:rPr>
+          <w:b/>
+        </w:rPr>
+        <w:t xml:space="preserve">Step 17: </w:t>
+      </w:r>
+      <w:r>
+        <w:t>Task 2.3: confirmed image delivery in Docker Hub - manishraje28/sample-web-app:v1.0.1 (tag = v1.0.&lt;run_number&gt;).</w:t>
+      </w:r>
+    </w:p>
+    <w:p>
+      <w:r>
+        <w:drawing>
+          <wp:inline xmlns:a="http://schemas.openxmlformats.org/drawingml/2006/main" xmlns:pic="http://schemas.openxmlformats.org/drawingml/2006/picture">
+            <wp:extent cx="5943600" cy="3714750"/>
+            <wp:docPr id="16" name="Picture 16"/>
+            <wp:cNvGraphicFramePr>
+              <a:graphicFrameLocks noChangeAspect="1"/>
+            </wp:cNvGraphicFramePr>
+            <a:graphic>
+              <a:graphicData uri="http://schemas.openxmlformats.org/drawingml/2006/picture">
+                <pic:pic>
+                  <pic:nvPicPr>
+                    <pic:cNvPr id="0" name="17_dockerhub_image.png"/>
+                    <pic:cNvPicPr/>
+                  </pic:nvPicPr>
+                  <pic:blipFill>
+                    <a:blip r:embed="rId24"/>
+                    <a:stretch>
+                      <a:fillRect/>
+                    </a:stretch>
+                  </pic:blipFill>
+                  <pic:spPr>
+                    <a:xfrm>
+                      <a:off x="0" y="0"/>
+                      <a:ext cx="5943600" cy="3714750"/>
+                    </a:xfrm>
+                    <a:prstGeom prst="rect"/>
+                  </pic:spPr>
+                </pic:pic>
+              </a:graphicData>
+            </a:graphic>
+          </wp:inline>
+        </w:drawing>
+      </w:r>
+    </w:p>
+    <w:p>
+      <w:r>
+        <w:rPr>
+          <w:b/>
+        </w:rPr>
+        <w:t xml:space="preserve">Step 18: </w:t>
+      </w:r>
+      <w:r>
+        <w:t>Extra: rolled the CI-built image into Minikube with 'kubectl set image'; all 5 replicas now run manishraje28/sample-web-app:v1.0.1 and serve the custom page.</w:t>
+      </w:r>
+    </w:p>
+    <w:p>
+      <w:r>
+        <w:drawing>
+          <wp:inline xmlns:a="http://schemas.openxmlformats.org/drawingml/2006/main" xmlns:pic="http://schemas.openxmlformats.org/drawingml/2006/picture">
+            <wp:extent cx="5943600" cy="2087867"/>
+            <wp:docPr id="17" name="Picture 17"/>
+            <wp:cNvGraphicFramePr>
+              <a:graphicFrameLocks noChangeAspect="1"/>
+            </wp:cNvGraphicFramePr>
+            <a:graphic>
+              <a:graphicData uri="http://schemas.openxmlformats.org/drawingml/2006/picture">
+                <pic:pic>
+                  <pic:nvPicPr>
+                    <pic:cNvPr id="0" name="18_deploy_ci_image.png"/>
+                    <pic:cNvPicPr/>
+                  </pic:nvPicPr>
+                  <pic:blipFill>
+                    <a:blip r:embed="rId25"/>
+                    <a:stretch>
+                      <a:fillRect/>
+                    </a:stretch>
+                  </pic:blipFill>
+                  <pic:spPr>
+                    <a:xfrm>
+                      <a:off x="0" y="0"/>
+                      <a:ext cx="5943600" cy="2087867"/>
+                    </a:xfrm>
+                    <a:prstGeom prst="rect"/>
+                  </pic:spPr>
+                </pic:pic>
+              </a:graphicData>
+            </a:graphic>
+          </wp:inline>
+        </w:drawing>
+      </w:r>
+    </w:p>
+    <w:p>
+      <w:r>
+        <w:rPr>
+          <w:b/>
+        </w:rPr>
+        <w:t xml:space="preserve">Step 19: </w:t>
+      </w:r>
+      <w:r>
+        <w:t>Phase 3: generated the submission report Experiment8_Report.pdf (repo link, YAML files, pipeline log, the 3 required screenshots, quiz answers, reflection answers), then pushed screenshots and report to GitHub.</w:t>
+      </w:r>
+    </w:p>
     <w:sectPr>
       <w:pgSz w:w="12240" w:h="15840"/>
       <w:pgMar w:top="1440" w:right="1800" w:bottom="1440" w:left="1800" w:header="720" w:footer="720" w:gutter="0"/>

</xml_diff>